<commit_message>
new: timecalculation part added
</commit_message>
<xml_diff>
--- a/advanced C-assessment/module 2/module 2.docx
+++ b/advanced C-assessment/module 2/module 2.docx
@@ -4,6 +4,9 @@
   <w:body>
     <w:p>
       <w:r>
+        <w:rPr>
+          <w:noProof/>
+        </w:rPr>
         <w:drawing>
           <wp:inline distT="0" distB="0" distL="0" distR="0" wp14:anchorId="4045FC60" wp14:editId="7D28C92F">
             <wp:extent cx="6530340" cy="4078605"/>
@@ -29,6 +32,88 @@
                     <a:xfrm>
                       <a:off x="0" y="0"/>
                       <a:ext cx="6530340" cy="4078605"/>
+                    </a:xfrm>
+                    <a:prstGeom prst="rect">
+                      <a:avLst/>
+                    </a:prstGeom>
+                  </pic:spPr>
+                </pic:pic>
+              </a:graphicData>
+            </a:graphic>
+          </wp:inline>
+        </w:drawing>
+      </w:r>
+    </w:p>
+    <w:p>
+      <w:r>
+        <w:rPr>
+          <w:noProof/>
+        </w:rPr>
+        <w:drawing>
+          <wp:inline distT="0" distB="0" distL="0" distR="0" wp14:anchorId="6B7D9528" wp14:editId="75E1FD48">
+            <wp:extent cx="6530340" cy="3766820"/>
+            <wp:effectExtent l="0" t="0" r="3810" b="5080"/>
+            <wp:docPr id="423119051" name="Picture 1"/>
+            <wp:cNvGraphicFramePr>
+              <a:graphicFrameLocks xmlns:a="http://schemas.openxmlformats.org/drawingml/2006/main" noChangeAspect="1"/>
+            </wp:cNvGraphicFramePr>
+            <a:graphic xmlns:a="http://schemas.openxmlformats.org/drawingml/2006/main">
+              <a:graphicData uri="http://schemas.openxmlformats.org/drawingml/2006/picture">
+                <pic:pic xmlns:pic="http://schemas.openxmlformats.org/drawingml/2006/picture">
+                  <pic:nvPicPr>
+                    <pic:cNvPr id="423119051" name=""/>
+                    <pic:cNvPicPr/>
+                  </pic:nvPicPr>
+                  <pic:blipFill>
+                    <a:blip r:embed="rId5"/>
+                    <a:stretch>
+                      <a:fillRect/>
+                    </a:stretch>
+                  </pic:blipFill>
+                  <pic:spPr>
+                    <a:xfrm>
+                      <a:off x="0" y="0"/>
+                      <a:ext cx="6530340" cy="3766820"/>
+                    </a:xfrm>
+                    <a:prstGeom prst="rect">
+                      <a:avLst/>
+                    </a:prstGeom>
+                  </pic:spPr>
+                </pic:pic>
+              </a:graphicData>
+            </a:graphic>
+          </wp:inline>
+        </w:drawing>
+      </w:r>
+    </w:p>
+    <w:p>
+      <w:r>
+        <w:lastRenderedPageBreak/>
+        <w:drawing>
+          <wp:inline distT="0" distB="0" distL="0" distR="0" wp14:anchorId="3A7E01C2" wp14:editId="3D6D64EF">
+            <wp:extent cx="6530340" cy="3277772"/>
+            <wp:effectExtent l="0" t="0" r="3810" b="0"/>
+            <wp:docPr id="93605328" name="Picture 1"/>
+            <wp:cNvGraphicFramePr>
+              <a:graphicFrameLocks xmlns:a="http://schemas.openxmlformats.org/drawingml/2006/main" noChangeAspect="1"/>
+            </wp:cNvGraphicFramePr>
+            <a:graphic xmlns:a="http://schemas.openxmlformats.org/drawingml/2006/main">
+              <a:graphicData uri="http://schemas.openxmlformats.org/drawingml/2006/picture">
+                <pic:pic xmlns:pic="http://schemas.openxmlformats.org/drawingml/2006/picture">
+                  <pic:nvPicPr>
+                    <pic:cNvPr id="93605328" name=""/>
+                    <pic:cNvPicPr/>
+                  </pic:nvPicPr>
+                  <pic:blipFill>
+                    <a:blip r:embed="rId6"/>
+                    <a:stretch>
+                      <a:fillRect/>
+                    </a:stretch>
+                  </pic:blipFill>
+                  <pic:spPr>
+                    <a:xfrm>
+                      <a:off x="0" y="0"/>
+                      <a:ext cx="6538815" cy="3282026"/>
                     </a:xfrm>
                     <a:prstGeom prst="rect">
                       <a:avLst/>

</xml_diff>

<commit_message>
fix: issue in  sequential and parallel execution fixed
</commit_message>
<xml_diff>
--- a/advanced C-assessment/module 2/module 2.docx
+++ b/advanced C-assessment/module 2/module 2.docx
@@ -2,6 +2,126 @@
 <file path=word/document.xml><?xml version="1.0" encoding="utf-8"?>
 <w:document xmlns:wpc="http://schemas.microsoft.com/office/word/2010/wordprocessingCanvas" xmlns:cx="http://schemas.microsoft.com/office/drawing/2014/chartex" xmlns:cx1="http://schemas.microsoft.com/office/drawing/2015/9/8/chartex" xmlns:cx2="http://schemas.microsoft.com/office/drawing/2015/10/21/chartex" xmlns:cx3="http://schemas.microsoft.com/office/drawing/2016/5/9/chartex" xmlns:cx4="http://schemas.microsoft.com/office/drawing/2016/5/10/chartex" xmlns:cx5="http://schemas.microsoft.com/office/drawing/2016/5/11/chartex" xmlns:cx6="http://schemas.microsoft.com/office/drawing/2016/5/12/chartex" xmlns:cx7="http://schemas.microsoft.com/office/drawing/2016/5/13/chartex" xmlns:cx8="http://schemas.microsoft.com/office/drawing/2016/5/14/chartex" xmlns:mc="http://schemas.openxmlformats.org/markup-compatibility/2006" xmlns:aink="http://schemas.microsoft.com/office/drawing/2016/ink" xmlns:am3d="http://schemas.microsoft.com/office/drawing/2017/model3d" xmlns:o="urn:schemas-microsoft-com:office:office" xmlns:oel="http://schemas.microsoft.com/office/2019/extlst" xmlns:r="http://schemas.openxmlformats.org/officeDocument/2006/relationships" xmlns:m="http://schemas.openxmlformats.org/officeDocument/2006/math" xmlns:v="urn:schemas-microsoft-com:vml" xmlns:wp14="http://schemas.microsoft.com/office/word/2010/wordprocessingDrawing" xmlns:wp="http://schemas.openxmlformats.org/drawingml/2006/wordprocessingDrawing" xmlns:w10="urn:schemas-microsoft-com:office:word" xmlns:w="http://schemas.openxmlformats.org/wordprocessingml/2006/main" xmlns:w14="http://schemas.microsoft.com/office/word/2010/wordml" xmlns:w15="http://schemas.microsoft.com/office/word/2012/wordml" xmlns:w16cex="http://schemas.microsoft.com/office/word/2018/wordml/cex" xmlns:w16cid="http://schemas.microsoft.com/office/word/2016/wordml/cid" xmlns:w16="http://schemas.microsoft.com/office/word/2018/wordml" xmlns:w16du="http://schemas.microsoft.com/office/word/2023/wordml/word16du" xmlns:w16sdtdh="http://schemas.microsoft.com/office/word/2020/wordml/sdtdatahash" xmlns:w16sdtfl="http://schemas.microsoft.com/office/word/2024/wordml/sdtformatlock" xmlns:w16se="http://schemas.microsoft.com/office/word/2015/wordml/symex" xmlns:wpg="http://schemas.microsoft.com/office/word/2010/wordprocessingGroup" xmlns:wpi="http://schemas.microsoft.com/office/word/2010/wordprocessingInk" xmlns:wne="http://schemas.microsoft.com/office/word/2006/wordml" xmlns:wps="http://schemas.microsoft.com/office/word/2010/wordprocessingShape" mc:Ignorable="w14 w15 w16se w16cid w16 w16cex w16sdtdh w16sdtfl w16du wp14">
   <w:body>
+    <w:p>
+      <w:pPr>
+        <w:jc w:val="center"/>
+        <w:rPr>
+          <w:rFonts w:ascii="Times New Roman" w:hAnsi="Times New Roman" w:cs="Times New Roman"/>
+          <w:noProof/>
+          <w:sz w:val="28"/>
+          <w:szCs w:val="28"/>
+        </w:rPr>
+      </w:pPr>
+      <w:r>
+        <w:rPr>
+          <w:rFonts w:ascii="Times New Roman" w:hAnsi="Times New Roman" w:cs="Times New Roman"/>
+          <w:noProof/>
+          <w:sz w:val="28"/>
+          <w:szCs w:val="28"/>
+        </w:rPr>
+        <w:t>Structured Training Program: Advance C Programming</w:t>
+      </w:r>
+    </w:p>
+    <w:p>
+      <w:pPr>
+        <w:jc w:val="center"/>
+        <w:rPr>
+          <w:rFonts w:ascii="Times New Roman" w:hAnsi="Times New Roman" w:cs="Times New Roman"/>
+          <w:noProof/>
+          <w:sz w:val="28"/>
+          <w:szCs w:val="28"/>
+        </w:rPr>
+      </w:pPr>
+      <w:r>
+        <w:rPr>
+          <w:rFonts w:ascii="Times New Roman" w:hAnsi="Times New Roman" w:cs="Times New Roman"/>
+          <w:noProof/>
+          <w:sz w:val="28"/>
+          <w:szCs w:val="28"/>
+        </w:rPr>
+        <w:t xml:space="preserve">Week </w:t>
+      </w:r>
+      <w:r>
+        <w:rPr>
+          <w:rFonts w:ascii="Times New Roman" w:hAnsi="Times New Roman" w:cs="Times New Roman"/>
+          <w:noProof/>
+          <w:sz w:val="28"/>
+          <w:szCs w:val="28"/>
+        </w:rPr>
+        <w:t>2</w:t>
+      </w:r>
+      <w:r>
+        <w:rPr>
+          <w:rFonts w:ascii="Times New Roman" w:hAnsi="Times New Roman" w:cs="Times New Roman"/>
+          <w:noProof/>
+          <w:sz w:val="28"/>
+          <w:szCs w:val="28"/>
+        </w:rPr>
+        <w:t xml:space="preserve"> – </w:t>
+      </w:r>
+      <w:r>
+        <w:rPr>
+          <w:rFonts w:ascii="Times New Roman" w:hAnsi="Times New Roman" w:cs="Times New Roman"/>
+          <w:noProof/>
+          <w:sz w:val="28"/>
+          <w:szCs w:val="28"/>
+        </w:rPr>
+        <w:t>Signals and Threads</w:t>
+      </w:r>
+    </w:p>
+    <w:p>
+      <w:pPr>
+        <w:rPr>
+          <w:rFonts w:ascii="Times New Roman" w:hAnsi="Times New Roman" w:cs="Times New Roman"/>
+          <w:noProof/>
+          <w:sz w:val="28"/>
+          <w:szCs w:val="28"/>
+        </w:rPr>
+      </w:pPr>
+    </w:p>
+    <w:p>
+      <w:pPr>
+        <w:rPr>
+          <w:rFonts w:ascii="Times New Roman" w:hAnsi="Times New Roman" w:cs="Times New Roman"/>
+          <w:noProof/>
+          <w:sz w:val="28"/>
+          <w:szCs w:val="28"/>
+        </w:rPr>
+      </w:pPr>
+      <w:r>
+        <w:rPr>
+          <w:rFonts w:ascii="Times New Roman" w:hAnsi="Times New Roman" w:cs="Times New Roman"/>
+          <w:noProof/>
+          <w:sz w:val="28"/>
+          <w:szCs w:val="28"/>
+        </w:rPr>
+        <w:t>1. Write a program to define 3 different threads with the following purpose where N is the input</w:t>
+      </w:r>
+    </w:p>
+    <w:p>
+      <w:pPr>
+        <w:pStyle w:val="ListParagraph"/>
+        <w:numPr>
+          <w:ilvl w:val="0"/>
+          <w:numId w:val="1"/>
+        </w:numPr>
+        <w:rPr>
+          <w:rFonts w:ascii="Times New Roman" w:hAnsi="Times New Roman" w:cs="Times New Roman"/>
+          <w:noProof/>
+          <w:sz w:val="28"/>
+          <w:szCs w:val="28"/>
+        </w:rPr>
+      </w:pPr>
+      <w:r>
+        <w:rPr>
+          <w:rFonts w:ascii="Times New Roman" w:hAnsi="Times New Roman" w:cs="Times New Roman"/>
+          <w:noProof/>
+          <w:sz w:val="28"/>
+          <w:szCs w:val="28"/>
+        </w:rPr>
+        <w:t>Thread A  - To run a loop and return the sum of first N prime numbers.</w:t>
+      </w:r>
+    </w:p>
     <w:p>
       <w:r>
         <w:rPr>
@@ -23,7 +143,7 @@
                     <pic:cNvPicPr/>
                   </pic:nvPicPr>
                   <pic:blipFill>
-                    <a:blip r:embed="rId4"/>
+                    <a:blip r:embed="rId5"/>
                     <a:stretch>
                       <a:fillRect/>
                     </a:stretch>
@@ -49,6 +169,7 @@
         <w:rPr>
           <w:noProof/>
         </w:rPr>
+        <w:lastRenderedPageBreak/>
         <w:drawing>
           <wp:inline distT="0" distB="0" distL="0" distR="0" wp14:anchorId="6B7D9528" wp14:editId="75E1FD48">
             <wp:extent cx="6530340" cy="3766820"/>
@@ -65,7 +186,7 @@
                     <pic:cNvPicPr/>
                   </pic:nvPicPr>
                   <pic:blipFill>
-                    <a:blip r:embed="rId5"/>
+                    <a:blip r:embed="rId6"/>
                     <a:stretch>
                       <a:fillRect/>
                     </a:stretch>
@@ -88,7 +209,9 @@
     </w:p>
     <w:p>
       <w:r>
-        <w:lastRenderedPageBreak/>
+        <w:rPr>
+          <w:noProof/>
+        </w:rPr>
         <w:drawing>
           <wp:inline distT="0" distB="0" distL="0" distR="0" wp14:anchorId="3A7E01C2" wp14:editId="3D6D64EF">
             <wp:extent cx="6530340" cy="3277772"/>
@@ -105,7 +228,7 @@
                     <pic:cNvPicPr/>
                   </pic:nvPicPr>
                   <pic:blipFill>
-                    <a:blip r:embed="rId6"/>
+                    <a:blip r:embed="rId7"/>
                     <a:stretch>
                       <a:fillRect/>
                     </a:stretch>
@@ -129,11 +252,138 @@
     <w:sectPr>
       <w:pgSz w:w="11906" w:h="16838" w:code="9"/>
       <w:pgMar w:top="1077" w:right="811" w:bottom="1077" w:left="811" w:header="709" w:footer="709" w:gutter="0"/>
+      <w:pgBorders w:offsetFrom="page">
+        <w:top w:val="single" w:sz="12" w:space="24" w:color="auto"/>
+        <w:left w:val="single" w:sz="12" w:space="24" w:color="auto"/>
+        <w:bottom w:val="single" w:sz="12" w:space="24" w:color="auto"/>
+        <w:right w:val="single" w:sz="12" w:space="24" w:color="auto"/>
+      </w:pgBorders>
       <w:cols w:space="708"/>
       <w:docGrid w:linePitch="360"/>
     </w:sectPr>
   </w:body>
 </w:document>
+</file>
+
+<file path=word/numbering.xml><?xml version="1.0" encoding="utf-8"?>
+<w:numbering xmlns:wpc="http://schemas.microsoft.com/office/word/2010/wordprocessingCanvas" xmlns:cx="http://schemas.microsoft.com/office/drawing/2014/chartex" xmlns:cx1="http://schemas.microsoft.com/office/drawing/2015/9/8/chartex" xmlns:cx2="http://schemas.microsoft.com/office/drawing/2015/10/21/chartex" xmlns:cx3="http://schemas.microsoft.com/office/drawing/2016/5/9/chartex" xmlns:cx4="http://schemas.microsoft.com/office/drawing/2016/5/10/chartex" xmlns:cx5="http://schemas.microsoft.com/office/drawing/2016/5/11/chartex" xmlns:cx6="http://schemas.microsoft.com/office/drawing/2016/5/12/chartex" xmlns:cx7="http://schemas.microsoft.com/office/drawing/2016/5/13/chartex" xmlns:cx8="http://schemas.microsoft.com/office/drawing/2016/5/14/chartex" xmlns:mc="http://schemas.openxmlformats.org/markup-compatibility/2006" xmlns:aink="http://schemas.microsoft.com/office/drawing/2016/ink" xmlns:am3d="http://schemas.microsoft.com/office/drawing/2017/model3d" xmlns:o="urn:schemas-microsoft-com:office:office" xmlns:oel="http://schemas.microsoft.com/office/2019/extlst" xmlns:r="http://schemas.openxmlformats.org/officeDocument/2006/relationships" xmlns:m="http://schemas.openxmlformats.org/officeDocument/2006/math" xmlns:v="urn:schemas-microsoft-com:vml" xmlns:wp14="http://schemas.microsoft.com/office/word/2010/wordprocessingDrawing" xmlns:wp="http://schemas.openxmlformats.org/drawingml/2006/wordprocessingDrawing" xmlns:w10="urn:schemas-microsoft-com:office:word" xmlns:w="http://schemas.openxmlformats.org/wordprocessingml/2006/main" xmlns:w14="http://schemas.microsoft.com/office/word/2010/wordml" xmlns:w15="http://schemas.microsoft.com/office/word/2012/wordml" xmlns:w16cex="http://schemas.microsoft.com/office/word/2018/wordml/cex" xmlns:w16cid="http://schemas.microsoft.com/office/word/2016/wordml/cid" xmlns:w16="http://schemas.microsoft.com/office/word/2018/wordml" xmlns:w16du="http://schemas.microsoft.com/office/word/2023/wordml/word16du" xmlns:w16sdtdh="http://schemas.microsoft.com/office/word/2020/wordml/sdtdatahash" xmlns:w16sdtfl="http://schemas.microsoft.com/office/word/2024/wordml/sdtformatlock" xmlns:w16se="http://schemas.microsoft.com/office/word/2015/wordml/symex" xmlns:wpg="http://schemas.microsoft.com/office/word/2010/wordprocessingGroup" xmlns:wpi="http://schemas.microsoft.com/office/word/2010/wordprocessingInk" xmlns:wne="http://schemas.microsoft.com/office/word/2006/wordml" xmlns:wps="http://schemas.microsoft.com/office/word/2010/wordprocessingShape" mc:Ignorable="w14 w15 w16se w16cid w16 w16cex w16sdtdh w16sdtfl w16du wp14">
+  <w:abstractNum w:abstractNumId="0" w15:restartNumberingAfterBreak="0">
+    <w:nsid w:val="52C35977"/>
+    <w:multiLevelType w:val="hybridMultilevel"/>
+    <w:tmpl w:val="02F25A62"/>
+    <w:lvl w:ilvl="0" w:tplc="40090001">
+      <w:start w:val="1"/>
+      <w:numFmt w:val="bullet"/>
+      <w:lvlText w:val=""/>
+      <w:lvlJc w:val="left"/>
+      <w:pPr>
+        <w:ind w:left="720" w:hanging="360"/>
+      </w:pPr>
+      <w:rPr>
+        <w:rFonts w:ascii="Symbol" w:hAnsi="Symbol" w:hint="default"/>
+      </w:rPr>
+    </w:lvl>
+    <w:lvl w:ilvl="1" w:tplc="40090003" w:tentative="1">
+      <w:start w:val="1"/>
+      <w:numFmt w:val="bullet"/>
+      <w:lvlText w:val="o"/>
+      <w:lvlJc w:val="left"/>
+      <w:pPr>
+        <w:ind w:left="1440" w:hanging="360"/>
+      </w:pPr>
+      <w:rPr>
+        <w:rFonts w:ascii="Courier New" w:hAnsi="Courier New" w:cs="Courier New" w:hint="default"/>
+      </w:rPr>
+    </w:lvl>
+    <w:lvl w:ilvl="2" w:tplc="40090005" w:tentative="1">
+      <w:start w:val="1"/>
+      <w:numFmt w:val="bullet"/>
+      <w:lvlText w:val=""/>
+      <w:lvlJc w:val="left"/>
+      <w:pPr>
+        <w:ind w:left="2160" w:hanging="360"/>
+      </w:pPr>
+      <w:rPr>
+        <w:rFonts w:ascii="Wingdings" w:hAnsi="Wingdings" w:hint="default"/>
+      </w:rPr>
+    </w:lvl>
+    <w:lvl w:ilvl="3" w:tplc="40090001" w:tentative="1">
+      <w:start w:val="1"/>
+      <w:numFmt w:val="bullet"/>
+      <w:lvlText w:val=""/>
+      <w:lvlJc w:val="left"/>
+      <w:pPr>
+        <w:ind w:left="2880" w:hanging="360"/>
+      </w:pPr>
+      <w:rPr>
+        <w:rFonts w:ascii="Symbol" w:hAnsi="Symbol" w:hint="default"/>
+      </w:rPr>
+    </w:lvl>
+    <w:lvl w:ilvl="4" w:tplc="40090003" w:tentative="1">
+      <w:start w:val="1"/>
+      <w:numFmt w:val="bullet"/>
+      <w:lvlText w:val="o"/>
+      <w:lvlJc w:val="left"/>
+      <w:pPr>
+        <w:ind w:left="3600" w:hanging="360"/>
+      </w:pPr>
+      <w:rPr>
+        <w:rFonts w:ascii="Courier New" w:hAnsi="Courier New" w:cs="Courier New" w:hint="default"/>
+      </w:rPr>
+    </w:lvl>
+    <w:lvl w:ilvl="5" w:tplc="40090005" w:tentative="1">
+      <w:start w:val="1"/>
+      <w:numFmt w:val="bullet"/>
+      <w:lvlText w:val=""/>
+      <w:lvlJc w:val="left"/>
+      <w:pPr>
+        <w:ind w:left="4320" w:hanging="360"/>
+      </w:pPr>
+      <w:rPr>
+        <w:rFonts w:ascii="Wingdings" w:hAnsi="Wingdings" w:hint="default"/>
+      </w:rPr>
+    </w:lvl>
+    <w:lvl w:ilvl="6" w:tplc="40090001" w:tentative="1">
+      <w:start w:val="1"/>
+      <w:numFmt w:val="bullet"/>
+      <w:lvlText w:val=""/>
+      <w:lvlJc w:val="left"/>
+      <w:pPr>
+        <w:ind w:left="5040" w:hanging="360"/>
+      </w:pPr>
+      <w:rPr>
+        <w:rFonts w:ascii="Symbol" w:hAnsi="Symbol" w:hint="default"/>
+      </w:rPr>
+    </w:lvl>
+    <w:lvl w:ilvl="7" w:tplc="40090003" w:tentative="1">
+      <w:start w:val="1"/>
+      <w:numFmt w:val="bullet"/>
+      <w:lvlText w:val="o"/>
+      <w:lvlJc w:val="left"/>
+      <w:pPr>
+        <w:ind w:left="5760" w:hanging="360"/>
+      </w:pPr>
+      <w:rPr>
+        <w:rFonts w:ascii="Courier New" w:hAnsi="Courier New" w:cs="Courier New" w:hint="default"/>
+      </w:rPr>
+    </w:lvl>
+    <w:lvl w:ilvl="8" w:tplc="40090005" w:tentative="1">
+      <w:start w:val="1"/>
+      <w:numFmt w:val="bullet"/>
+      <w:lvlText w:val=""/>
+      <w:lvlJc w:val="left"/>
+      <w:pPr>
+        <w:ind w:left="6480" w:hanging="360"/>
+      </w:pPr>
+      <w:rPr>
+        <w:rFonts w:ascii="Wingdings" w:hAnsi="Wingdings" w:hint="default"/>
+      </w:rPr>
+    </w:lvl>
+  </w:abstractNum>
+  <w:num w:numId="1" w16cid:durableId="627589429">
+    <w:abstractNumId w:val="0"/>
+  </w:num>
+</w:numbering>
 </file>
 
 <file path=word/styles.xml><?xml version="1.0" encoding="utf-8"?>

</xml_diff>